<commit_message>
add laporan setelah dan sedang sempro
</commit_message>
<xml_diff>
--- a/laporan/Notes-Sempro.docx
+++ b/laporan/Notes-Sempro.docx
@@ -3868,6 +3868,9 @@
     <w:p/>
     <w:p>
       <w:r>
+        <w:rPr>
+          <w:noProof/>
+        </w:rPr>
         <w:drawing>
           <wp:inline distT="0" distB="0" distL="0" distR="0" wp14:anchorId="725547B8" wp14:editId="367A05DC">
             <wp:extent cx="5888350" cy="5539563"/>
@@ -3907,6 +3910,9 @@
     </w:p>
     <w:p>
       <w:r>
+        <w:rPr>
+          <w:noProof/>
+        </w:rPr>
         <w:lastRenderedPageBreak/>
         <w:drawing>
           <wp:inline distT="0" distB="0" distL="0" distR="0" wp14:anchorId="581B0E70" wp14:editId="77FA115F">
@@ -3954,6 +3960,7 @@
       </w:pPr>
       <w:r>
         <w:rPr>
+          <w:noProof/>
           <w:lang w:val="id-ID"/>
         </w:rPr>
         <w:lastRenderedPageBreak/>
@@ -4002,6 +4009,7 @@
       </w:pPr>
       <w:r>
         <w:rPr>
+          <w:noProof/>
           <w:lang w:val="id-ID"/>
         </w:rPr>
         <w:lastRenderedPageBreak/>
@@ -4050,6 +4058,7 @@
       </w:pPr>
       <w:r>
         <w:rPr>
+          <w:noProof/>
           <w:lang w:val="id-ID"/>
         </w:rPr>
         <w:lastRenderedPageBreak/>
@@ -5068,6 +5077,7 @@
   <w:style w:type="character" w:default="1" w:styleId="DefaultParagraphFont">
     <w:name w:val="Default Paragraph Font"/>
     <w:uiPriority w:val="1"/>
+    <w:semiHidden/>
     <w:unhideWhenUsed/>
   </w:style>
   <w:style w:type="table" w:default="1" w:styleId="TableNormal">

</xml_diff>